<commit_message>
Feat: Agregar Segundo Corte y CodigosEnClase
</commit_message>
<xml_diff>
--- a/PrimerCorte/PrimeParcial/prueba_corte1/Cuadernillo_Estudiante_Prueba_Corte1.docx
+++ b/PrimerCorte/PrimeParcial/prueba_corte1/Cuadernillo_Estudiante_Prueba_Corte1.docx
@@ -197,6 +197,393 @@
           <w:p>
             <w:r>
               <w:t>31/08/2026</w:t>
+            </w:r>
+          </w:p>
+        </w:tc>
+      </w:tr>
+      <w:tr>
+        <w:tc>
+          <w:tcPr>
+            <w:tcW w:w="2100" w:type="dxa"/>
+            <w:shd w:val="clear" w:color="auto" w:fill="1F3864"/>
+            <w:tcMar>
+              <w:top w:w="60" w:type="dxa"/>
+              <w:left w:w="100" w:type="dxa"/>
+              <w:bottom w:w="60" w:type="dxa"/>
+              <w:right w:w="100" w:type="dxa"/>
+            </w:tcMar>
+            <w:vAlign w:val="center"/>
+          </w:tcPr>
+          <w:p>
+            <w:pPr>
+              <w:rPr>
+                <w:b/>
+                <w:bCs/>
+                <w:color w:val="FFFFFF"/>
+                <w:sz w:val="17"/>
+                <w:szCs w:val="17"/>
+              </w:rPr>
+            </w:pPr>
+            <w:r>
+              <w:rPr>
+                <w:b/>
+                <w:bCs/>
+                <w:color w:val="FFFFFF"/>
+                <w:sz w:val="17"/>
+                <w:szCs w:val="17"/>
+              </w:rPr>
+              <w:t>CALIFICAR LOS TICKETS</w:t>
+            </w:r>
+          </w:p>
+        </w:tc>
+        <w:tc>
+          <w:tcPr>
+            <w:tcW w:w="3200" w:type="dxa"/>
+            <w:tcMar>
+              <w:top w:w="60" w:type="dxa"/>
+              <w:left w:w="100" w:type="dxa"/>
+              <w:bottom w:w="60" w:type="dxa"/>
+              <w:right w:w="100" w:type="dxa"/>
+            </w:tcMar>
+            <w:vAlign w:val="center"/>
+          </w:tcPr>
+          <w:p>
+            <w:r>
+              <w:rPr>
+                <w:color w:val="000000"/>
+                <w:sz w:val="18"/>
+                <w:szCs w:val="18"/>
+              </w:rPr>
+              <w:t>TCK-4419</w:t>
+            </w:r>
+          </w:p>
+        </w:tc>
+        <w:tc>
+          <w:tcPr>
+            <w:tcW w:w="1600" w:type="dxa"/>
+            <w:shd w:val="clear" w:color="auto" w:fill="1F3864"/>
+            <w:tcMar>
+              <w:top w:w="60" w:type="dxa"/>
+              <w:left w:w="100" w:type="dxa"/>
+              <w:bottom w:w="60" w:type="dxa"/>
+              <w:right w:w="100" w:type="dxa"/>
+            </w:tcMar>
+            <w:vAlign w:val="center"/>
+          </w:tcPr>
+          <w:p>
+            <w:pPr>
+              <w:rPr>
+                <w:b/>
+                <w:bCs/>
+                <w:color w:val="FFFFFF"/>
+                <w:sz w:val="17"/>
+                <w:szCs w:val="17"/>
+              </w:rPr>
+            </w:pPr>
+          </w:p>
+        </w:tc>
+        <w:tc>
+          <w:tcPr>
+            <w:tcW w:w="2600" w:type="dxa"/>
+            <w:tcMar>
+              <w:top w:w="60" w:type="dxa"/>
+              <w:left w:w="100" w:type="dxa"/>
+              <w:bottom w:w="60" w:type="dxa"/>
+              <w:right w:w="100" w:type="dxa"/>
+            </w:tcMar>
+            <w:vAlign w:val="center"/>
+          </w:tcPr>
+          <w:p>
+            <w:r>
+              <w:t>P4</w:t>
+            </w:r>
+          </w:p>
+        </w:tc>
+      </w:tr>
+      <w:tr>
+        <w:tc>
+          <w:tcPr>
+            <w:tcW w:w="2100" w:type="dxa"/>
+            <w:shd w:val="clear" w:color="auto" w:fill="1F3864"/>
+            <w:tcMar>
+              <w:top w:w="60" w:type="dxa"/>
+              <w:left w:w="100" w:type="dxa"/>
+              <w:bottom w:w="60" w:type="dxa"/>
+              <w:right w:w="100" w:type="dxa"/>
+            </w:tcMar>
+            <w:vAlign w:val="center"/>
+          </w:tcPr>
+          <w:p>
+            <w:pPr>
+              <w:rPr>
+                <w:b/>
+                <w:bCs/>
+                <w:color w:val="FFFFFF"/>
+                <w:sz w:val="17"/>
+                <w:szCs w:val="17"/>
+              </w:rPr>
+            </w:pPr>
+          </w:p>
+        </w:tc>
+        <w:tc>
+          <w:tcPr>
+            <w:tcW w:w="3200" w:type="dxa"/>
+            <w:tcMar>
+              <w:top w:w="60" w:type="dxa"/>
+              <w:left w:w="100" w:type="dxa"/>
+              <w:bottom w:w="60" w:type="dxa"/>
+              <w:right w:w="100" w:type="dxa"/>
+            </w:tcMar>
+            <w:vAlign w:val="center"/>
+          </w:tcPr>
+          <w:p>
+            <w:pPr>
+              <w:rPr>
+                <w:color w:val="000000"/>
+                <w:sz w:val="18"/>
+                <w:szCs w:val="18"/>
+              </w:rPr>
+            </w:pPr>
+            <w:r>
+              <w:rPr>
+                <w:color w:val="000000"/>
+                <w:sz w:val="18"/>
+                <w:szCs w:val="18"/>
+              </w:rPr>
+              <w:t>TCK-4420</w:t>
+            </w:r>
+          </w:p>
+        </w:tc>
+        <w:tc>
+          <w:tcPr>
+            <w:tcW w:w="1600" w:type="dxa"/>
+            <w:shd w:val="clear" w:color="auto" w:fill="1F3864"/>
+            <w:tcMar>
+              <w:top w:w="60" w:type="dxa"/>
+              <w:left w:w="100" w:type="dxa"/>
+              <w:bottom w:w="60" w:type="dxa"/>
+              <w:right w:w="100" w:type="dxa"/>
+            </w:tcMar>
+            <w:vAlign w:val="center"/>
+          </w:tcPr>
+          <w:p>
+            <w:pPr>
+              <w:rPr>
+                <w:b/>
+                <w:bCs/>
+                <w:color w:val="FFFFFF"/>
+                <w:sz w:val="17"/>
+                <w:szCs w:val="17"/>
+              </w:rPr>
+            </w:pPr>
+          </w:p>
+        </w:tc>
+        <w:tc>
+          <w:tcPr>
+            <w:tcW w:w="2600" w:type="dxa"/>
+            <w:tcMar>
+              <w:top w:w="60" w:type="dxa"/>
+              <w:left w:w="100" w:type="dxa"/>
+              <w:bottom w:w="60" w:type="dxa"/>
+              <w:right w:w="100" w:type="dxa"/>
+            </w:tcMar>
+            <w:vAlign w:val="center"/>
+          </w:tcPr>
+          <w:p>
+            <w:r>
+              <w:t>P3</w:t>
+            </w:r>
+          </w:p>
+        </w:tc>
+      </w:tr>
+      <w:tr>
+        <w:tc>
+          <w:tcPr>
+            <w:tcW w:w="2100" w:type="dxa"/>
+            <w:shd w:val="clear" w:color="auto" w:fill="1F3864"/>
+            <w:tcMar>
+              <w:top w:w="60" w:type="dxa"/>
+              <w:left w:w="100" w:type="dxa"/>
+              <w:bottom w:w="60" w:type="dxa"/>
+              <w:right w:w="100" w:type="dxa"/>
+            </w:tcMar>
+            <w:vAlign w:val="center"/>
+          </w:tcPr>
+          <w:p>
+            <w:pPr>
+              <w:rPr>
+                <w:b/>
+                <w:bCs/>
+                <w:color w:val="FFFFFF"/>
+                <w:sz w:val="17"/>
+                <w:szCs w:val="17"/>
+              </w:rPr>
+            </w:pPr>
+          </w:p>
+        </w:tc>
+        <w:tc>
+          <w:tcPr>
+            <w:tcW w:w="3200" w:type="dxa"/>
+            <w:tcMar>
+              <w:top w:w="60" w:type="dxa"/>
+              <w:left w:w="100" w:type="dxa"/>
+              <w:bottom w:w="60" w:type="dxa"/>
+              <w:right w:w="100" w:type="dxa"/>
+            </w:tcMar>
+            <w:vAlign w:val="center"/>
+          </w:tcPr>
+          <w:p>
+            <w:pPr>
+              <w:rPr>
+                <w:color w:val="000000"/>
+                <w:sz w:val="18"/>
+                <w:szCs w:val="18"/>
+              </w:rPr>
+            </w:pPr>
+            <w:r>
+              <w:rPr>
+                <w:color w:val="000000"/>
+                <w:sz w:val="18"/>
+                <w:szCs w:val="18"/>
+              </w:rPr>
+              <w:t>TCK-4421</w:t>
+            </w:r>
+          </w:p>
+        </w:tc>
+        <w:tc>
+          <w:tcPr>
+            <w:tcW w:w="1600" w:type="dxa"/>
+            <w:shd w:val="clear" w:color="auto" w:fill="1F3864"/>
+            <w:tcMar>
+              <w:top w:w="60" w:type="dxa"/>
+              <w:left w:w="100" w:type="dxa"/>
+              <w:bottom w:w="60" w:type="dxa"/>
+              <w:right w:w="100" w:type="dxa"/>
+            </w:tcMar>
+            <w:vAlign w:val="center"/>
+          </w:tcPr>
+          <w:p>
+            <w:pPr>
+              <w:rPr>
+                <w:b/>
+                <w:bCs/>
+                <w:color w:val="FFFFFF"/>
+                <w:sz w:val="17"/>
+                <w:szCs w:val="17"/>
+              </w:rPr>
+            </w:pPr>
+          </w:p>
+        </w:tc>
+        <w:tc>
+          <w:tcPr>
+            <w:tcW w:w="2600" w:type="dxa"/>
+            <w:tcMar>
+              <w:top w:w="60" w:type="dxa"/>
+              <w:left w:w="100" w:type="dxa"/>
+              <w:bottom w:w="60" w:type="dxa"/>
+              <w:right w:w="100" w:type="dxa"/>
+            </w:tcMar>
+            <w:vAlign w:val="center"/>
+          </w:tcPr>
+          <w:p>
+            <w:r>
+              <w:t>P2</w:t>
+            </w:r>
+          </w:p>
+        </w:tc>
+      </w:tr>
+      <w:tr>
+        <w:tc>
+          <w:tcPr>
+            <w:tcW w:w="2100" w:type="dxa"/>
+            <w:shd w:val="clear" w:color="auto" w:fill="1F3864"/>
+            <w:tcMar>
+              <w:top w:w="60" w:type="dxa"/>
+              <w:left w:w="100" w:type="dxa"/>
+              <w:bottom w:w="60" w:type="dxa"/>
+              <w:right w:w="100" w:type="dxa"/>
+            </w:tcMar>
+            <w:vAlign w:val="center"/>
+          </w:tcPr>
+          <w:p>
+            <w:pPr>
+              <w:rPr>
+                <w:b/>
+                <w:bCs/>
+                <w:color w:val="FFFFFF"/>
+                <w:sz w:val="17"/>
+                <w:szCs w:val="17"/>
+              </w:rPr>
+            </w:pPr>
+          </w:p>
+        </w:tc>
+        <w:tc>
+          <w:tcPr>
+            <w:tcW w:w="3200" w:type="dxa"/>
+            <w:tcMar>
+              <w:top w:w="60" w:type="dxa"/>
+              <w:left w:w="100" w:type="dxa"/>
+              <w:bottom w:w="60" w:type="dxa"/>
+              <w:right w:w="100" w:type="dxa"/>
+            </w:tcMar>
+            <w:vAlign w:val="center"/>
+          </w:tcPr>
+          <w:p>
+            <w:pPr>
+              <w:rPr>
+                <w:color w:val="000000"/>
+                <w:sz w:val="18"/>
+                <w:szCs w:val="18"/>
+              </w:rPr>
+            </w:pPr>
+            <w:r>
+              <w:rPr>
+                <w:color w:val="000000"/>
+                <w:sz w:val="18"/>
+                <w:szCs w:val="18"/>
+              </w:rPr>
+              <w:t>TCK-4422</w:t>
+            </w:r>
+          </w:p>
+        </w:tc>
+        <w:tc>
+          <w:tcPr>
+            <w:tcW w:w="1600" w:type="dxa"/>
+            <w:shd w:val="clear" w:color="auto" w:fill="1F3864"/>
+            <w:tcMar>
+              <w:top w:w="60" w:type="dxa"/>
+              <w:left w:w="100" w:type="dxa"/>
+              <w:bottom w:w="60" w:type="dxa"/>
+              <w:right w:w="100" w:type="dxa"/>
+            </w:tcMar>
+            <w:vAlign w:val="center"/>
+          </w:tcPr>
+          <w:p>
+            <w:pPr>
+              <w:rPr>
+                <w:b/>
+                <w:bCs/>
+                <w:color w:val="FFFFFF"/>
+                <w:sz w:val="17"/>
+                <w:szCs w:val="17"/>
+              </w:rPr>
+            </w:pPr>
+          </w:p>
+        </w:tc>
+        <w:tc>
+          <w:tcPr>
+            <w:tcW w:w="2600" w:type="dxa"/>
+            <w:tcMar>
+              <w:top w:w="60" w:type="dxa"/>
+              <w:left w:w="100" w:type="dxa"/>
+              <w:bottom w:w="60" w:type="dxa"/>
+              <w:right w:w="100" w:type="dxa"/>
+            </w:tcMar>
+            <w:vAlign w:val="center"/>
+          </w:tcPr>
+          <w:p>
+            <w:r>
+              <w:t>P1</w:t>
             </w:r>
           </w:p>
         </w:tc>
@@ -28361,7 +28748,11 @@
             </w:tcMar>
             <w:vAlign w:val="center"/>
           </w:tcPr>
-          <w:p/>
+          <w:p>
+            <w:r>
+              <w:t>4420-7135</w:t>
+            </w:r>
+          </w:p>
         </w:tc>
         <w:tc>
           <w:tcPr>
@@ -28481,7 +28872,11 @@
             </w:tcMar>
             <w:vAlign w:val="center"/>
           </w:tcPr>
-          <w:p/>
+          <w:p>
+            <w:r>
+              <w:t>4421-89825</w:t>
+            </w:r>
+          </w:p>
         </w:tc>
         <w:tc>
           <w:tcPr>
@@ -28723,7 +29118,11 @@
             </w:tcMar>
             <w:vAlign w:val="center"/>
           </w:tcPr>
-          <w:p/>
+          <w:p>
+            <w:r>
+              <w:t>4423-534</w:t>
+            </w:r>
+          </w:p>
         </w:tc>
         <w:tc>
           <w:tcPr>

</xml_diff>